<commit_message>
Add merged v2 chapters 10 and 11; restore two council lines in Ch7
Ch10 (The Key) and Ch11 (The Board) merged from Opus and Fable drafts,
with Word versions, briefs, drafts and comparisons/ch10-11.md. Ch7 gets
back Sarvajna's "beneath the scales" line and Drasta's "Prepare while
preparation is still possible" so Ch10's callbacks land.

Co-Authored-By: Claude Opus 5.5 <noreply@anthropic.com>
</commit_message>
<xml_diff>
--- a/claude-notes/manuscript-v2/07-then-the-silence-merged.docx
+++ b/claude-notes/manuscript-v2/07-then-the-silence-merged.docx
@@ -716,6 +716,15 @@
           <w:b w:val="0"/>
           <w:i w:val="0"/>
         </w:rPr>
+        <w:t>"The past cannot be changed by regret," Draṣṭā said. "The present must be met by action, and the future often warns us before it arrives. Prepare while preparation is still possible."</w:t>
+      </w:r>
+    </w:p>
+    <w:p>
+      <w:r>
+        <w:rPr>
+          <w:b w:val="0"/>
+          <w:i w:val="0"/>
+        </w:rPr>
         <w:t>Sarvajña leaned forward. The stones at his cuff touched the wood with a dry click. Where Draṣṭā had read possibilities, he spoke like a man reading figures off a ledger he had audited himself.</w:t>
       </w:r>
     </w:p>
@@ -725,7 +734,7 @@
           <w:b w:val="0"/>
           <w:i w:val="0"/>
         </w:rPr>
-        <w:t>"The animosity between the ganas did not begin with you. It has existed since the ganas were instituted, and the elders have spent generations balancing the scales between them. Balance is not resolution." He turned one of the stones under his thumb. "This month a proposal for a new wing of the Drona library cleared our internal review. When we carried the request to Kubera's treasury, the funds did not move. Conversations took place in closed rooms. The transfer has not been released."</w:t>
+        <w:t>"The animosity between the ganas did not begin with you. It has existed since the ganas were instituted, and the elders have spent generations balancing the scales between them. Balance is not resolution. And while we have watched the scales, something indescribable has begun to form beneath them." He turned one of the stones under his thumb. "This month a proposal for a new wing of the Drona library cleared our internal review. When we carried the request to Kubera's treasury, the funds did not move. Conversations took place in closed rooms. The transfer has not been released."</w:t>
       </w:r>
     </w:p>
     <w:p>

</xml_diff>

<commit_message>
Ch7 review: Drona names the price ("You signed"); Elara bargains
"Why me?" now answers with her name on the struck record: Drona won't remove
it or lie for her, and makes her the boys' monitor of record. She bargains
for their file to cross her console first; ends on "I signed." Keep "Not by
destiny" and "Drona stands behind you" (agent, not chosen one). Cut the
briefing to a third (frozen transfer handed as an object), one-line card
glosses, fix Vishnu father/god and the Sanskrit, name Drona's Grandmaster,
new Book 1 Ch3 epigraph, cut "the way" similes and epigrams.

Co-Authored-By: Claude Opus 5.5 <noreply@anthropic.com>
</commit_message>
<xml_diff>
--- a/claude-notes/manuscript-v2/07-then-the-silence-merged.docx
+++ b/claude-notes/manuscript-v2/07-then-the-silence-merged.docx
@@ -20,9 +20,10 @@
         <w:rPr>
           <w:b w:val="0"/>
           <w:i/>
+          <w:strike w:val="0"/>
           <w:color w:val="5C6B7D"/>
         </w:rPr>
-        <w:t>In his dream, Ben saw his father’s face. Oscar had always told him that the Trinity didn’t just harvest coal; they harvested the capacity to care. He knew the system wanted human engines — tools driven by grinding fear. To survive without becoming a bot, you had to maintain the one thing the ledger couldn’t calculate: Empathy.</w:t>
+        <w:t>To her, Gage, Ben, and Otto weren’t children experiencing their first full stomach; they were newly activated units on her ledger. She noted the Engine sharing his polymer pouch — a deviation in resource management — with a flick of her finger.</w:t>
       </w:r>
     </w:p>
     <w:p>
@@ -30,9 +31,10 @@
         <w:rPr>
           <w:b w:val="0"/>
           <w:i/>
+          <w:strike w:val="0"/>
           <w:color w:val="5C6B7D"/>
         </w:rPr>
-        <w:t>— Book 1, Chapter 4: Emily’s Not Talking</w:t>
+        <w:t>— Book 1, Chapter 3: The Initiation</w:t>
       </w:r>
     </w:p>
     <w:p>
@@ -49,6 +51,7 @@
         <w:rPr>
           <w:b w:val="0"/>
           <w:i w:val="0"/>
+          <w:strike w:val="0"/>
         </w:rPr>
         <w:t xml:space="preserve">The packet was waiting in her queue when she came in, sealed under the standard tag for post-shift line review. </w:t>
       </w:r>
@@ -56,6 +59,7 @@
         <w:rPr>
           <w:b w:val="0"/>
           <w:i/>
+          <w:strike w:val="0"/>
         </w:rPr>
         <w:t>Cohort 3A, Behavioral Correlation Assessment, Elara Nathan.</w:t>
       </w:r>
@@ -63,6 +67,7 @@
         <w:rPr>
           <w:b w:val="0"/>
           <w:i w:val="0"/>
+          <w:strike w:val="0"/>
         </w:rPr>
         <w:t xml:space="preserve"> Auto-generated at 02:13, in the last dark hours of the shift lock, while she had still been pinned at VARIANCE and the system had been writing about her in another room of itself.</w:t>
       </w:r>
@@ -72,8 +77,9 @@
         <w:rPr>
           <w:b w:val="0"/>
           <w:i w:val="0"/>
+          <w:strike w:val="0"/>
         </w:rPr>
-        <w:t>She bathed. She changed. She drank the nutrient broth the room had decided she needed and sat down at the study table with the packet. Gage's pulse profile. Ben's stress spikes. Otto's proximity data. On the fourth page, the system's first note on synchronized response, in language so level it could have been describing a pump. The system had seen it before she admitted it. It had only lacked a category, and she had given it one, and then gone down into the vaults and taken it away again.</w:t>
+        <w:t>She bathed. She changed. She drank the nutrient broth the room had decided she needed, printed the packet, and sat down at the study table with it. Gage's pulse profile. Ben's stress spikes. Otto's proximity data. On the fourth page, the system's first note on synchronized response, in language so level it could have been describing a pump. The system had seen it before she admitted it. It had only lacked a category, and she had given it one, and then gone down into the vaults and taken it away again.</w:t>
       </w:r>
     </w:p>
     <w:p>
@@ -81,6 +87,7 @@
         <w:rPr>
           <w:b w:val="0"/>
           <w:i w:val="0"/>
+          <w:strike w:val="0"/>
         </w:rPr>
         <w:t>The room dimmed on schedule. Sleep came in short drops. Her head dipped, she jerked up, and the clock on the wall had moved without her. The broth went cold and grew a skin. She pushed through another line, then another, until the letters ran together, and let her forehead come down.</w:t>
       </w:r>
@@ -90,6 +97,7 @@
         <w:rPr>
           <w:b w:val="0"/>
           <w:i w:val="0"/>
+          <w:strike w:val="0"/>
         </w:rPr>
         <w:t>She woke with her cheek on the table and the tip of her nose against the paper. The packet's staple had pressed a small square into the skin under her eye. She lay there and counted what the review could take. Back to records. Below the city. A room where no one would trust her to observe anything again.</w:t>
       </w:r>
@@ -99,6 +107,7 @@
         <w:rPr>
           <w:b w:val="0"/>
           <w:i w:val="0"/>
+          <w:strike w:val="0"/>
         </w:rPr>
         <w:t>Her head went down again. A thread of saliva cooled on her cheek. She didn't feel it.</w:t>
       </w:r>
@@ -108,6 +117,7 @@
         <w:rPr>
           <w:b w:val="0"/>
           <w:i w:val="0"/>
+          <w:strike w:val="0"/>
         </w:rPr>
         <w:t>At 5:00 a.m., someone knocked.</w:t>
       </w:r>
@@ -117,6 +127,7 @@
         <w:rPr>
           <w:b w:val="0"/>
           <w:i w:val="0"/>
+          <w:strike w:val="0"/>
         </w:rPr>
         <w:t>Three measured strikes against the sealed panel. The reader announced no name, and no clearance tone followed. She stayed where she was, neck bent against the table's edge, the taste of metal on her tongue, and the knocking came again, harder, and then a third time.</w:t>
       </w:r>
@@ -126,6 +137,7 @@
         <w:rPr>
           <w:b w:val="0"/>
           <w:i w:val="0"/>
+          <w:strike w:val="0"/>
         </w:rPr>
         <w:t>She pushed her hair off her face. The sleeve of her sleep shirt carried a pale crescent of table dust. She wiped her mouth with the back of her hand and put her palm to the reader.</w:t>
       </w:r>
@@ -135,8 +147,9 @@
         <w:rPr>
           <w:b w:val="0"/>
           <w:i w:val="0"/>
+          <w:strike w:val="0"/>
         </w:rPr>
-        <w:t>Two Trinity guards stood in the corridor, dark uniforms, collars fastened to the throat. The one on the left was older and looked her over once, the way a clerk checks a crate against its manifest. The one on the right was younger than she was. A shaving nick on his jaw still had a twist of paper stuck to it, and he kept his eyes on the door frame a hand's width from her head.</w:t>
+        <w:t>Two Trinity guards stood in the corridor, dark uniforms, collars fastened to the throat. The one on the left was older and checked her once against something only he could see. The one on the right was younger than she was. A shaving nick on his jaw still had a twist of paper stuck to it, and he kept his eyes on the door frame a hand's width from her head.</w:t>
       </w:r>
     </w:p>
     <w:p>
@@ -144,6 +157,7 @@
         <w:rPr>
           <w:b w:val="0"/>
           <w:i w:val="0"/>
+          <w:strike w:val="0"/>
         </w:rPr>
         <w:t>"Get dressed," the older one said.</w:t>
       </w:r>
@@ -153,6 +167,7 @@
         <w:rPr>
           <w:b w:val="0"/>
           <w:i w:val="0"/>
+          <w:strike w:val="0"/>
         </w:rPr>
         <w:t>Elara kept one hand on the door. "Why?"</w:t>
       </w:r>
@@ -162,6 +177,7 @@
         <w:rPr>
           <w:b w:val="0"/>
           <w:i w:val="0"/>
+          <w:strike w:val="0"/>
         </w:rPr>
         <w:t>"Drona review committee summons." He held out a thin black card, white lettering on it.</w:t>
       </w:r>
@@ -171,6 +187,7 @@
         <w:rPr>
           <w:b/>
           <w:i w:val="0"/>
+          <w:strike w:val="0"/>
         </w:rPr>
         <w:t>08:00 — DRONA REVIEW CONFERENCE ROOM</w:t>
       </w:r>
@@ -180,6 +197,7 @@
         <w:rPr>
           <w:b w:val="0"/>
           <w:i w:val="0"/>
+          <w:strike w:val="0"/>
         </w:rPr>
         <w:t>"You will report directly to the committee. You will not return to the monitoring floor before the review."</w:t>
       </w:r>
@@ -189,6 +207,7 @@
         <w:rPr>
           <w:b w:val="0"/>
           <w:i w:val="0"/>
+          <w:strike w:val="0"/>
         </w:rPr>
         <w:t>She took the card. Her fingers left a damp print on its surface.</w:t>
       </w:r>
@@ -198,6 +217,7 @@
         <w:rPr>
           <w:b w:val="0"/>
           <w:i w:val="0"/>
+          <w:strike w:val="0"/>
         </w:rPr>
         <w:t>"Is this an inquiry?"</w:t>
       </w:r>
@@ -207,6 +227,7 @@
         <w:rPr>
           <w:b w:val="0"/>
           <w:i w:val="0"/>
+          <w:strike w:val="0"/>
         </w:rPr>
         <w:t>Neither of them answered. The young one's eyes went past her at last, to the open packet, the skinned broth, the dent her head had left in the pages, and came back to the door frame faster than they had gone.</w:t>
       </w:r>
@@ -216,6 +237,7 @@
         <w:rPr>
           <w:b w:val="0"/>
           <w:i w:val="0"/>
+          <w:strike w:val="0"/>
         </w:rPr>
         <w:t>"Get dressed, Monitor Nathan."</w:t>
       </w:r>
@@ -225,6 +247,7 @@
         <w:rPr>
           <w:b w:val="0"/>
           <w:i w:val="0"/>
+          <w:strike w:val="0"/>
         </w:rPr>
         <w:t>The seal closed between them.</w:t>
       </w:r>
@@ -234,6 +257,7 @@
         <w:rPr>
           <w:b w:val="0"/>
           <w:i w:val="0"/>
+          <w:strike w:val="0"/>
         </w:rPr>
         <w:t>She dressed without the full lights. Uniform. Collar. Seal. She rehearsed the words she could use: procedural judgment, incomplete evidence, candidate safety.</w:t>
       </w:r>
@@ -243,8 +267,9 @@
         <w:rPr>
           <w:b w:val="0"/>
           <w:i w:val="0"/>
+          <w:strike w:val="0"/>
         </w:rPr>
-        <w:t>Vishnu had never let her think of karma as a court waiting with a sentence. Karma, he said, was the shape a choice makes after it leaves the person who made it. Hers had left her at an unattended terminal in the sub-tier vaults, and it had been travelling ever since.</w:t>
+        <w:t>Her father, Vishnu, had never let her think of karma as a court waiting with a sentence. Karma, he said, was the shape a choice makes after it leaves the person who made it. Hers had left her at an unattended terminal in the sub-tier vaults, and it had been travelling ever since.</w:t>
       </w:r>
     </w:p>
     <w:p>
@@ -252,6 +277,7 @@
         <w:rPr>
           <w:b w:val="0"/>
           <w:i w:val="0"/>
+          <w:strike w:val="0"/>
         </w:rPr>
         <w:t>At seven the collar clasp missed. Her fingernail caught on the metal edge and bent back.</w:t>
       </w:r>
@@ -261,6 +287,7 @@
         <w:rPr>
           <w:b w:val="0"/>
           <w:i w:val="0"/>
+          <w:strike w:val="0"/>
         </w:rPr>
         <w:t>The hallway was familiar enough to hurt: the alcove beside the archive lift, the bench under the ventilation grille, the window that showed only filtered cloud. Then the turn into the Corridor of Knowledge, where the architecture changed without getting any grander. Drona had never needed height to announce itself. Its corridor was narrow and pale and lined with sealed glass cases: a cracked lens, a brass measuring arm, bone-handled instruments for studying the stars. Portraits of scientists hung between shrines to the ancient sanyashis. The oldest books lay open side by side, an astronomical text beside a religious epic.</w:t>
       </w:r>
@@ -270,6 +297,7 @@
         <w:rPr>
           <w:b w:val="0"/>
           <w:i w:val="0"/>
+          <w:strike w:val="0"/>
         </w:rPr>
         <w:t>She stopped at the brass arm.</w:t>
       </w:r>
@@ -279,6 +307,7 @@
         <w:rPr>
           <w:b w:val="0"/>
           <w:i w:val="0"/>
+          <w:strike w:val="0"/>
         </w:rPr>
         <w:t>Its hinge was worn bright where a dead man's thumb had worked it, and one thumbscrew had long ago been replaced with a bent length of wire. She had drawn it in her first year, cross-legged on this floor with a board across her knees, trying to get the joint where the arm folded back on itself. She had never got the joint. Her right hand curled at her side, thumb against two fingers, around a pencil that wasn't there, and she let it. The shape of holding something brought her breathing down to where it belonged. A fleck of green verdigris still sat on the pivot screw, exactly where it had been when she was seventeen.</w:t>
       </w:r>
@@ -288,15 +317,9 @@
         <w:rPr>
           <w:b w:val="0"/>
           <w:i w:val="0"/>
+          <w:strike w:val="0"/>
         </w:rPr>
-        <w:t xml:space="preserve">She walked on. Every preserved object along the glass seemed to ask her the same thing without speaking. </w:t>
-      </w:r>
-      <w:r>
-        <w:rPr>
-          <w:b w:val="0"/>
-          <w:i/>
-        </w:rPr>
-        <w:t>What did you do with what you knew?</w:t>
+        <w:t>She walked on.</w:t>
       </w:r>
     </w:p>
     <w:p>
@@ -304,8 +327,9 @@
         <w:rPr>
           <w:b w:val="0"/>
           <w:i w:val="0"/>
+          <w:strike w:val="0"/>
         </w:rPr>
-        <w:t>The corridor narrowed before it ended and opened into the conference wing, where the rooms still kept the shape of the gurukul. In one, two students were restoring a damaged painting, and their mentor guided the angle of a brush with two fingers laid on the back of a hand, and said nothing at all. Truth was being made the slow way in every room. Elara had made hers in one minute, alone.</w:t>
+        <w:t>The corridor narrowed before it ended and opened into the conference wing, where the rooms still kept the shape of the gurukul. In one, two students were restoring a damaged painting, and their mentor guided the angle of a brush with two fingers laid on the back of a hand, and said nothing at all.</w:t>
       </w:r>
     </w:p>
     <w:p>
@@ -313,6 +337,7 @@
         <w:rPr>
           <w:b w:val="0"/>
           <w:i w:val="0"/>
+          <w:strike w:val="0"/>
         </w:rPr>
         <w:t>The conference room waited at the end of the wing behind a door of clear glass, the committee's shapes already seated on the other side.</w:t>
       </w:r>
@@ -322,8 +347,9 @@
         <w:rPr>
           <w:b w:val="0"/>
           <w:i w:val="0"/>
+          <w:strike w:val="0"/>
         </w:rPr>
-        <w:t>She stepped in, and relief hit her so hard her shoulders dropped. Two of the faces at the long table were hers. Elder Anandi, whose lectures on observational ethics had shaped her first year. Mentor Kavik, the quiet mathematician who had taught her to separate pattern from impulse, his left thumb stained with ink to the first knuckle the way it had always been. For one breath she believed they would understand.</w:t>
+        <w:t>She stepped in, and relief hit her so hard her shoulders dropped. Two of the faces at the long table were hers. Elder Anandi, whose lectures on observational ethics had shaped her first year. Mentor Kavik, the quiet mathematician who had taught her to separate pattern from impulse, his left thumb stained with ink to the first knuckle, as it had always been. For one breath she believed they would understand.</w:t>
       </w:r>
     </w:p>
     <w:p>
@@ -331,6 +357,7 @@
         <w:rPr>
           <w:b w:val="0"/>
           <w:i w:val="0"/>
+          <w:strike w:val="0"/>
         </w:rPr>
         <w:t>Then the room widened beyond them.</w:t>
       </w:r>
@@ -340,6 +367,7 @@
         <w:rPr>
           <w:b w:val="0"/>
           <w:i w:val="0"/>
+          <w:strike w:val="0"/>
         </w:rPr>
         <w:t>Three strangers sat nearest the center of the table. The first wore a long plain robe of saffron and ash, a strange choice in a house that had always insisted learning must not be governed by doctrine. His right wrist rested on the wood, and the cuff of his sleeve was threaded with seven small stones in a narrow line. Four for the Vedas, Elara remembered, three for interpretation, silence and living transmission.</w:t>
       </w:r>
@@ -349,8 +377,9 @@
         <w:rPr>
           <w:b w:val="0"/>
           <w:i w:val="0"/>
+          <w:strike w:val="0"/>
         </w:rPr>
-        <w:t>Beside him, a woman held a deck of cards older than manufacture, thick and hand-beveled, one corner mended with a single stitch of thread. She shuffled them out of habit, without ceremony, the way someone else might handle a measuring rod.</w:t>
+        <w:t>Beside him, a woman held a deck of cards older than manufacture, thick and hand-beveled, one corner mended with a single stitch of thread. She shuffled them out of habit, without ceremony, as another teacher might roll a pencil.</w:t>
       </w:r>
     </w:p>
     <w:p>
@@ -358,8 +387,9 @@
         <w:rPr>
           <w:b w:val="0"/>
           <w:i w:val="0"/>
+          <w:strike w:val="0"/>
         </w:rPr>
-        <w:t>The last sat at the far end of the table. A plain grey shawl, darned once at the shoulder in thread a shade too dark, over a cotton tunic, a face lined with the patience of years, and no mark of lineage or office anywhere on her. It was hard to look away from her eyes. They held a steadiness older than the room, the look of someone who had watched a great many people until there was nothing left in them to perform.</w:t>
+        <w:t>The last sat at the far end of the table. A plain grey shawl, darned once at the shoulder in thread a shade too dark, over a cotton tunic, a face lined with the patience of years, and no mark of lineage or office anywhere on her. It was hard to look away from her eyes. They held a steadiness older than the room.</w:t>
       </w:r>
     </w:p>
     <w:p>
@@ -367,6 +397,7 @@
         <w:rPr>
           <w:b w:val="0"/>
           <w:i w:val="0"/>
+          <w:strike w:val="0"/>
         </w:rPr>
         <w:t>Elara took the nearest chair before the table could decide whether she was meant to stand. She drew breath to begin.</w:t>
       </w:r>
@@ -376,6 +407,7 @@
         <w:rPr>
           <w:b w:val="0"/>
           <w:i w:val="0"/>
+          <w:strike w:val="0"/>
         </w:rPr>
         <w:t>The woman at the end lifted one hand.</w:t>
       </w:r>
@@ -385,6 +417,7 @@
         <w:rPr>
           <w:b w:val="0"/>
           <w:i w:val="0"/>
+          <w:strike w:val="0"/>
         </w:rPr>
         <w:t>The palm turned outward, toward Elara, fingers relaxed and open. That was all. The words caught in Elara's throat and stayed there. Her mouth would not open. The breath she had drawn stalled halfway in, and her chest locked around it and would not let it go. The silence thickened until she could not tell whether it belonged to the room or to her own body.</w:t>
       </w:r>
@@ -394,6 +427,7 @@
         <w:rPr>
           <w:b w:val="0"/>
           <w:i w:val="0"/>
+          <w:strike w:val="0"/>
         </w:rPr>
         <w:t>Then the woman lowered her hand.</w:t>
       </w:r>
@@ -403,8 +437,9 @@
         <w:rPr>
           <w:b w:val="0"/>
           <w:i w:val="0"/>
+          <w:strike w:val="0"/>
         </w:rPr>
-        <w:t>Elara's lungs tore open. She bent over the table with one hand at her collar, gasping, ragged, the feeling of drowning and being hauled onto a deck at once. Her eyes ran. Her pulse slammed in her ears. When she could, she forced herself upright, and understood what the room had just shown her: her voice and her breath were things this committee could grant or withhold. She had been brought here to learn the terms of the question. Her answer could wait.</w:t>
+        <w:t>Elara's lungs tore open. She bent over the table with one hand at her collar, gasping, ragged, the feeling of drowning and being hauled onto a deck at once. Her eyes ran. Her pulse slammed in her ears. When she could, she forced herself upright. Her voice and her breath were things this table could grant or withhold, and they had wanted her to know it before she said a word.</w:t>
       </w:r>
     </w:p>
     <w:p>
@@ -412,8 +447,9 @@
         <w:rPr>
           <w:b w:val="0"/>
           <w:i w:val="0"/>
+          <w:strike w:val="0"/>
         </w:rPr>
-        <w:t>The elder spoke, and the words came in Sanskrit, the language of the scriptures in Vishnu's cabinet, older than Trinity, older than the cities Trinity had replaced.</w:t>
+        <w:t>The woman at the end of the table spoke, and the words came in Sanskrit, the language of the scriptures in her father's cabinet, older than Trinity, older than the cities Trinity had replaced.</w:t>
       </w:r>
     </w:p>
     <w:p>
@@ -421,8 +457,9 @@
         <w:rPr>
           <w:b w:val="0"/>
           <w:i w:val="0"/>
+          <w:strike w:val="0"/>
         </w:rPr>
-        <w:t>"मोनितोरा नातन, अधुना वक्तुं अर्हसि। अपि च, यानि अस्माभिः परिकल्पितानि प्रश्नानि तानि एव तेओभ्युपगच्छन्तु, न तु स्वस्यात्मनः परिकल्पितानि।"</w:t>
+        <w:t>"मॉनिटर नाथन, अधुना वक्तुम् अर्हसि। किन्तु ये प्रश्नाः अस्माभिः परिकल्पिताः, त एव त्वया स्वीकर्तव्याः, न तु स्वयं परिकल्पिताः।"</w:t>
       </w:r>
     </w:p>
     <w:p>
@@ -430,6 +467,7 @@
         <w:rPr>
           <w:b w:val="0"/>
           <w:i w:val="0"/>
+          <w:strike w:val="0"/>
         </w:rPr>
         <w:t>She inclined her head toward Kavik, and he translated without any change in his face.</w:t>
       </w:r>
@@ -439,8 +477,9 @@
         <w:rPr>
           <w:b w:val="0"/>
           <w:i w:val="0"/>
+          <w:strike w:val="0"/>
         </w:rPr>
-        <w:t>"Monitor Nathan, you may now speak. Furthermore, let only those questions that have been devised by us be taken up by you — not ones devised by your own self."</w:t>
+        <w:t>"Monitor Nathan, you may speak now. But the questions you take up will be the ones we have devised, not ones you devise yourself."</w:t>
       </w:r>
     </w:p>
     <w:p>
@@ -448,8 +487,9 @@
         <w:rPr>
           <w:b w:val="0"/>
           <w:i w:val="0"/>
+          <w:strike w:val="0"/>
         </w:rPr>
-        <w:t>The meaning had stirred in Elara before Kavik reached it, somewhere at the back of her mind where her father's voice still recited, familiar and impossible to hold.</w:t>
+        <w:t>The meaning had stirred in Elara before Kavik reached it, somewhere at the back of her mind where her father's voice still recited.</w:t>
       </w:r>
     </w:p>
     <w:p>
@@ -457,8 +497,9 @@
         <w:rPr>
           <w:b w:val="0"/>
           <w:i w:val="0"/>
+          <w:strike w:val="0"/>
         </w:rPr>
-        <w:t>"प्रवृत्तेः पूर्वम्," the elder said. "अद्य अस्यां सभायाम् उपविष्टेभ्यः आचार्येभ्यः उचितम् आदरं दर्शयत। आचार्याः एकैकशः स्वपरिचयं कुर्वन्तु।"</w:t>
+        <w:t>"प्रवृत्तेः पूर्वम् अद्य अस्यां सभायाम् उपविष्टेभ्यः आचार्येभ्यः उचितम् आदरं दर्शय। आचार्याः एकैकशः स्वपरिचयं कुर्वन्तु।"</w:t>
       </w:r>
     </w:p>
     <w:p>
@@ -466,8 +507,17 @@
         <w:rPr>
           <w:b w:val="0"/>
           <w:i w:val="0"/>
+          <w:strike w:val="0"/>
         </w:rPr>
-        <w:t>"Before getting involved," Kavik said, "show due respect to the teachers sitting in this meeting today. Let the teachers introduce themselves one by one."</w:t>
+        <w:t xml:space="preserve">This time Kavik didn't translate, and didn't need to. </w:t>
+      </w:r>
+      <w:r>
+        <w:rPr>
+          <w:b w:val="0"/>
+          <w:i/>
+          <w:strike w:val="0"/>
+        </w:rPr>
+        <w:t>First, honor the teachers at this table. Let them name themselves.</w:t>
       </w:r>
     </w:p>
     <w:p>
@@ -475,6 +525,7 @@
         <w:rPr>
           <w:b w:val="0"/>
           <w:i w:val="0"/>
+          <w:strike w:val="0"/>
         </w:rPr>
         <w:t>The man in the saffron robe spoke first, his voice deep and even. "I am Sarvajña, the all-knowing. I keep Drona steady upon its three pillars: knowledge, disciplined inquiry, and the duty to serve truth before power."</w:t>
       </w:r>
@@ -484,6 +535,7 @@
         <w:rPr>
           <w:b w:val="0"/>
           <w:i w:val="0"/>
+          <w:strike w:val="0"/>
         </w:rPr>
         <w:t>"I am Draṣṭā, the seer," said the woman with the cards. There was nothing theatrical in it. "My duty is to know the three times: the past, the present, and the future. Nothing is certain, and I do not pretend otherwise."</w:t>
       </w:r>
@@ -493,6 +545,7 @@
         <w:rPr>
           <w:b w:val="0"/>
           <w:i w:val="0"/>
+          <w:strike w:val="0"/>
         </w:rPr>
         <w:t>The woman at the end of the table waited until the room had settled around her.</w:t>
       </w:r>
@@ -502,8 +555,9 @@
         <w:rPr>
           <w:b w:val="0"/>
           <w:i w:val="0"/>
+          <w:strike w:val="0"/>
         </w:rPr>
-        <w:t>"I am the Grandmaster, known by many names depending on who you are and what you believe in," she said. "But today, the Ancient One sits well with me."</w:t>
+        <w:t>"I am Drona's Grandmaster, known by many names depending on who you are and what you believe in," she said. "Today, the Ancient One sits well with me."</w:t>
       </w:r>
     </w:p>
     <w:p>
@@ -511,6 +565,7 @@
         <w:rPr>
           <w:b w:val="0"/>
           <w:i w:val="0"/>
+          <w:strike w:val="0"/>
         </w:rPr>
         <w:t>She had crossed into the living language without a pause, and that unsettled Elara more than the Sanskrit had.</w:t>
       </w:r>
@@ -520,8 +575,9 @@
         <w:rPr>
           <w:b w:val="0"/>
           <w:i w:val="0"/>
+          <w:strike w:val="0"/>
         </w:rPr>
-        <w:t>"You know, of course, your mentors Anandi and Kavik. They have guided you longer than you realize." The Ancient One folded her hands. "We are gathered to meet you, and to share grave news, graver than you can imagine. We will not reflect today on your choices during the Initiation monitoring. That conversation is reserved for another time."</w:t>
+        <w:t>"You know your mentors, Anandi and Kavik. They have guided you longer than you realize." The Ancient One folded her hands. "Before anything else, Draṣṭā."</w:t>
       </w:r>
     </w:p>
     <w:p>
@@ -529,8 +585,9 @@
         <w:rPr>
           <w:b w:val="0"/>
           <w:i w:val="0"/>
+          <w:strike w:val="0"/>
         </w:rPr>
-        <w:t>She gave Draṣṭā the smallest signal. The seer squared the deck and spread it across the table in a long, uneven fan, dark backs up.</w:t>
+        <w:t>The seer squared the deck and spread it across the table in a long, uneven fan, dark backs up.</w:t>
       </w:r>
     </w:p>
     <w:p>
@@ -538,6 +595,7 @@
         <w:rPr>
           <w:b w:val="0"/>
           <w:i w:val="0"/>
+          <w:strike w:val="0"/>
         </w:rPr>
         <w:t>"Choose one."</w:t>
       </w:r>
@@ -547,6 +605,7 @@
         <w:rPr>
           <w:b w:val="0"/>
           <w:i/>
+          <w:strike w:val="0"/>
         </w:rPr>
         <w:t>Why?</w:t>
       </w:r>
@@ -554,8 +613,9 @@
         <w:rPr>
           <w:b w:val="0"/>
           <w:i w:val="0"/>
+          <w:strike w:val="0"/>
         </w:rPr>
-        <w:t xml:space="preserve"> It rose at once and stopped behind Elara's teeth. Only the questions the council had devised were hers to take up. She had never felt the cost of a rule so exactly as she did holding a question she was not permitted to ask.</w:t>
+        <w:t xml:space="preserve"> It rose at once and stopped behind Elara's teeth. Only the questions the council had devised were hers to take up.</w:t>
       </w:r>
     </w:p>
     <w:p>
@@ -563,8 +623,9 @@
         <w:rPr>
           <w:b w:val="0"/>
           <w:i w:val="0"/>
+          <w:strike w:val="0"/>
         </w:rPr>
-        <w:t>Draṣṭā looked at her and smiled faintly. It was the smile of someone who had heard the question cross the table without being spoken. She offered no answer. She waited.</w:t>
+        <w:t>Draṣṭā looked at her and smiled faintly, as if she had heard the question cross the table without being spoken. She offered no answer. She waited.</w:t>
       </w:r>
     </w:p>
     <w:p>
@@ -572,8 +633,9 @@
         <w:rPr>
           <w:b w:val="0"/>
           <w:i w:val="0"/>
+          <w:strike w:val="0"/>
         </w:rPr>
-        <w:t>If the news was as grave as they said, the danger already existed. A card would not create it, and refusing one would not cancel it. Elara reached for the first card in the fan.</w:t>
+        <w:t>If the news was as grave as the summons made it, the danger already existed. A card would not create it, and refusing one would not cancel it. Elara reached for the first card in the fan.</w:t>
       </w:r>
     </w:p>
     <w:p>
@@ -581,6 +643,7 @@
         <w:rPr>
           <w:b w:val="0"/>
           <w:i w:val="0"/>
+          <w:strike w:val="0"/>
         </w:rPr>
         <w:t xml:space="preserve">Draṣṭā turned it over. A king hung between a dark sky and the curve of the earth, neither rising nor falling. </w:t>
       </w:r>
@@ -588,6 +651,7 @@
         <w:rPr>
           <w:b w:val="0"/>
           <w:i/>
+          <w:strike w:val="0"/>
         </w:rPr>
         <w:t>Trishanku.</w:t>
       </w:r>
@@ -597,8 +661,9 @@
         <w:rPr>
           <w:b w:val="0"/>
           <w:i w:val="0"/>
+          <w:strike w:val="0"/>
         </w:rPr>
-        <w:t>"Pushed out of heaven and refused by the earth," Draṣṭā said, "and fixed in the space between, belonging to neither. Some outcomes refuse to resolve."</w:t>
+        <w:t>"Hung between categories," Draṣṭā said. "Refused by heaven and by the earth."</w:t>
       </w:r>
     </w:p>
     <w:p>
@@ -606,15 +671,7 @@
         <w:rPr>
           <w:b w:val="0"/>
           <w:i w:val="0"/>
-        </w:rPr>
-        <w:t>Elara saw three names flashing on a grid that hadn't known where to put them, and the small amber ticks that meant a human hand had finally done it.</w:t>
-      </w:r>
-    </w:p>
-    <w:p>
-      <w:r>
-        <w:rPr>
-          <w:b w:val="0"/>
-          <w:i w:val="0"/>
+          <w:strike w:val="0"/>
         </w:rPr>
         <w:t>"The second."</w:t>
       </w:r>
@@ -624,6 +681,7 @@
         <w:rPr>
           <w:b w:val="0"/>
           <w:i w:val="0"/>
+          <w:strike w:val="0"/>
         </w:rPr>
         <w:t xml:space="preserve">A warrior beneath a ruined sky, his weapon lowered but not surrendered. </w:t>
       </w:r>
@@ -631,6 +689,7 @@
         <w:rPr>
           <w:b w:val="0"/>
           <w:i/>
+          <w:strike w:val="0"/>
         </w:rPr>
         <w:t>Ashwatthama.</w:t>
       </w:r>
@@ -640,8 +699,9 @@
         <w:rPr>
           <w:b w:val="0"/>
           <w:i w:val="0"/>
+          <w:strike w:val="0"/>
         </w:rPr>
-        <w:t>"Conflict that cannot be ended," Draṣṭā said. "He loosed a weapon after the war was decided, and was cursed to survive without relief. He is also the son of Drona. You have chosen a son, while his father's house now stands by you."</w:t>
+        <w:t>"A conflict that cannot end," Draṣṭā said. "He is the son of Drona. You have drawn a son, and a father's house."</w:t>
       </w:r>
     </w:p>
     <w:p>
@@ -649,6 +709,7 @@
         <w:rPr>
           <w:b w:val="0"/>
           <w:i w:val="0"/>
+          <w:strike w:val="0"/>
         </w:rPr>
         <w:t>"The last."</w:t>
       </w:r>
@@ -658,6 +719,7 @@
         <w:rPr>
           <w:b w:val="0"/>
           <w:i w:val="0"/>
+          <w:strike w:val="0"/>
         </w:rPr>
         <w:t xml:space="preserve">A severed head rose against a darkened sun, its mouth open on the light. </w:t>
       </w:r>
@@ -665,6 +727,7 @@
         <w:rPr>
           <w:b w:val="0"/>
           <w:i/>
+          <w:strike w:val="0"/>
         </w:rPr>
         <w:t>Rahu.</w:t>
       </w:r>
@@ -674,13 +737,15 @@
         <w:rPr>
           <w:b w:val="0"/>
           <w:i w:val="0"/>
+          <w:strike w:val="0"/>
         </w:rPr>
-        <w:t xml:space="preserve">"He drank the stolen amrita, and the nectar reached his throat before Vishnu cut him in two. He chases the sun and moon and swallows them at eclipses, and cannot hold them. Danger that keeps coming back." Draṣṭā laid her fingertip beside the name. "The old word is </w:t>
+        <w:t xml:space="preserve">"The danger that keeps returning. He drank the stolen nectar, and the god Vishnu cut him in two before it went down, and he has chased the sun ever since." Draṣṭā laid her fingertip beside the name. "The old word for him is </w:t>
       </w:r>
       <w:r>
         <w:rPr>
           <w:b w:val="0"/>
           <w:i/>
+          <w:strike w:val="0"/>
         </w:rPr>
         <w:t>graha</w:t>
       </w:r>
@@ -688,8 +753,9 @@
         <w:rPr>
           <w:b w:val="0"/>
           <w:i w:val="0"/>
+          <w:strike w:val="0"/>
         </w:rPr>
-        <w:t>: that which seizes. Your system might call a boy's energy reading by that word without knowing what it said."</w:t>
+        <w:t>. That which seizes."</w:t>
       </w:r>
     </w:p>
     <w:p>
@@ -697,8 +763,9 @@
         <w:rPr>
           <w:b w:val="0"/>
           <w:i w:val="0"/>
+          <w:strike w:val="0"/>
         </w:rPr>
-        <w:t>Otto's force markers, spiking once, coming down last.</w:t>
+        <w:t>She left the three cards face up and said nothing about what any of them meant to Elara, and Elara found she couldn't stop looking at the second.</w:t>
       </w:r>
     </w:p>
     <w:p>
@@ -706,8 +773,9 @@
         <w:rPr>
           <w:b w:val="0"/>
           <w:i w:val="0"/>
+          <w:strike w:val="0"/>
         </w:rPr>
-        <w:t>"The past cannot be changed by regret," Draṣṭā said. "The present must be met by action, and the future often warns us before it arrives. Prepare while preparation is still possible."</w:t>
+        <w:t>"Prepare while preparation is still possible," Draṣṭā said.</w:t>
       </w:r>
     </w:p>
     <w:p>
@@ -715,8 +783,9 @@
         <w:rPr>
           <w:b w:val="0"/>
           <w:i w:val="0"/>
+          <w:strike w:val="0"/>
         </w:rPr>
-        <w:t>Sarvajña leaned forward. The stones at his cuff touched the wood with a dry click. Where Draṣṭā had read possibilities, he spoke like a man reading figures off a ledger he had audited himself.</w:t>
+        <w:t>Sarvajña leaned forward. The stones at his cuff touched the wood with a dry click. He took a single printed sheet from inside his robe and slid it across the table to her.</w:t>
       </w:r>
     </w:p>
     <w:p>
@@ -724,8 +793,9 @@
         <w:rPr>
           <w:b w:val="0"/>
           <w:i w:val="0"/>
+          <w:strike w:val="0"/>
         </w:rPr>
-        <w:t>"The animosity between the ganas did not begin with you. It has existed since the ganas were instituted, and the elders have spent generations balancing the scales between them. Balance is not resolution. And while we have watched the scales, something indescribable has begun to form beneath them." He turned one of the stones under his thumb. "This month a proposal for a new wing of the Drona library cleared our internal review. When we carried the request to Kubera's treasury, the funds did not move. Conversations took place in closed rooms. The transfer has not been released."</w:t>
+        <w:t>It was a transfer authorization. A new wing for the Drona library, approved through every internal review, carried to Kubera's treasury nine days ago. The amount. The seals. And across the release field, in Kubera's matte gold, one word: FROZEN.</w:t>
       </w:r>
     </w:p>
     <w:p>
@@ -733,8 +803,9 @@
         <w:rPr>
           <w:b w:val="0"/>
           <w:i w:val="0"/>
+          <w:strike w:val="0"/>
         </w:rPr>
-        <w:t>Kavik's pen moved across his page and stopped. Elara kept her hands still, because there was nothing she was allowed to do with them.</w:t>
+        <w:t>"Nine days," Sarvajña said. "No reason given. No officer named. Something indescribable has begun to form beneath the scales, and that is the first place it has touched us. It has no name and no office, and a thing like that is not built inside Kubera without its Grandmaster." His thumb turned one of the stones. "Kubera's representative failed at your station, in front of the other houses. He has since disappeared from Kubera's rolls."</w:t>
       </w:r>
     </w:p>
     <w:p>
@@ -742,33 +813,7 @@
         <w:rPr>
           <w:b w:val="0"/>
           <w:i w:val="0"/>
-        </w:rPr>
-        <w:t>"Our sources tell us a new power is gathering inside Kubera," Sarvajña went on. "It has no name, no public office, no designation that can be entered into a record. For months, every account has described the same thing: something extraordinarily strong taking shape behind the visible institution, waiting for the hand that will wield it. A power like that cannot be built without complete support. Not from one elder, or one department, but from the entire chain of authority in Kubera, all the way to its Grandmaster."</w:t>
-      </w:r>
-    </w:p>
-    <w:p>
-      <w:r>
-        <w:rPr>
-          <w:b w:val="0"/>
-          <w:i w:val="0"/>
-        </w:rPr>
-        <w:t>Elara's fingers found the edge of the table and closed on it. The wood was old and had been oiled by a great many hands, and under her grip it did not give at all.</w:t>
-      </w:r>
-    </w:p>
-    <w:p>
-      <w:r>
-        <w:rPr>
-          <w:b w:val="0"/>
-          <w:i w:val="0"/>
-        </w:rPr>
-        <w:t>Sarvajña watched her hold on. "The scales have held for generations because every action carried a name and could be weighed against an answering action. What cannot be recorded cannot be weighed, and what cannot be weighed cannot be answered." His thumb left the stone. "And we believe your Initiation stands among its first concerns. Kubera's representative moved against your candidates and failed, in front of the other houses, on footage every house has seen. He has since disappeared from Kubera's rolls."</w:t>
-      </w:r>
-    </w:p>
-    <w:p>
-      <w:r>
-        <w:rPr>
-          <w:b w:val="0"/>
-          <w:i w:val="0"/>
+          <w:strike w:val="0"/>
         </w:rPr>
         <w:t>Daren's chair at THRESHOLD. His pen tapping twice on the printed manual. Elara's thumb went to the raw hangnail on her left hand and pressed until it stung.</w:t>
       </w:r>
@@ -778,8 +823,9 @@
         <w:rPr>
           <w:b w:val="0"/>
           <w:i w:val="0"/>
+          <w:strike w:val="0"/>
         </w:rPr>
-        <w:t>"Kubera does not record its humiliations as accidents. You will stand at the center of it, Elara, when the consequences of these days begin to unfold." He sat back. "That is why we are here. Drona stands behind you. Your mentors will be your shadows from today, no matter what follows."</w:t>
+        <w:t>"Kubera does not record its humiliations as accidents," Sarvajña said. "When it answers this one, it will start where its representative failed. At your console."</w:t>
       </w:r>
     </w:p>
     <w:p>
@@ -787,8 +833,9 @@
         <w:rPr>
           <w:b w:val="0"/>
           <w:i w:val="0"/>
+          <w:strike w:val="0"/>
         </w:rPr>
-        <w:t>Anandi didn't look away from her. Kavik capped his pen.</w:t>
+        <w:t>He sat back. Anandi didn't look away from her. Kavik capped his pen.</w:t>
       </w:r>
     </w:p>
     <w:p>
@@ -796,8 +843,9 @@
         <w:rPr>
           <w:b w:val="0"/>
           <w:i w:val="0"/>
+          <w:strike w:val="0"/>
         </w:rPr>
-        <w:t>Then every elder at the table rose. They stood the way witnesses stand when the thing they came to see has already happened, and their voices came one after another, carrying a single sentence between them.</w:t>
+        <w:t>Elara looked down the table at four teachers and a woman who could take her breath with one hand, every one of them older and better trained than she was. She felt the question rise, and this time she didn't stop it at her teeth.</w:t>
       </w:r>
     </w:p>
     <w:p>
@@ -805,33 +853,7 @@
         <w:rPr>
           <w:b w:val="0"/>
           <w:i w:val="0"/>
-        </w:rPr>
-        <w:t>"This is the conflict every Drona representative prepares for across an entire lifetime. We have each wished, at one time or another, that the burden would fall upon any of us instead. It has fallen to you, Elara. You must persevere, and you must prevail."</w:t>
-      </w:r>
-    </w:p>
-    <w:p>
-      <w:r>
-        <w:rPr>
-          <w:b w:val="0"/>
-          <w:i w:val="0"/>
-        </w:rPr>
-        <w:t>The Ancient One held her eyes. "What is at stake is not Drona alone. If you fail, the foundation of everything we know to be real and just will be cracked."</w:t>
-      </w:r>
-    </w:p>
-    <w:p>
-      <w:r>
-        <w:rPr>
-          <w:b w:val="0"/>
-          <w:i w:val="0"/>
-        </w:rPr>
-        <w:t>Five teachers on their feet, every one of them older and better trained than she was, and each of them had wished it. Elara's hands came off the table edge. She felt the question rise the way the first one had, and this time she didn't stop it at her teeth.</w:t>
-      </w:r>
-    </w:p>
-    <w:p>
-      <w:r>
-        <w:rPr>
-          <w:b w:val="0"/>
-          <w:i w:val="0"/>
+          <w:strike w:val="0"/>
         </w:rPr>
         <w:t>"Why me, and not one of you?"</w:t>
       </w:r>
@@ -841,6 +863,7 @@
         <w:rPr>
           <w:b w:val="0"/>
           <w:i w:val="0"/>
+          <w:strike w:val="0"/>
         </w:rPr>
         <w:t>It went into the room like a dropped tool.</w:t>
       </w:r>
@@ -850,6 +873,7 @@
         <w:rPr>
           <w:b w:val="0"/>
           <w:i w:val="0"/>
+          <w:strike w:val="0"/>
         </w:rPr>
         <w:t>Kavik's capped pen rolled an inch on the table and he put out a finger to stop it. Anandi's breath went in and didn't come out. Sarvajña's fingers found the seventh stone and stayed there. At the end of the table, the Ancient One's hand lifted an inch off the wood, the same hand, and Elara's ribs remembered it before her mind did.</w:t>
       </w:r>
@@ -859,6 +883,7 @@
         <w:rPr>
           <w:b w:val="0"/>
           <w:i w:val="0"/>
+          <w:strike w:val="0"/>
         </w:rPr>
         <w:t>The hand went still. It did not rise.</w:t>
       </w:r>
@@ -868,6 +893,7 @@
         <w:rPr>
           <w:b w:val="0"/>
           <w:i w:val="0"/>
+          <w:strike w:val="0"/>
         </w:rPr>
         <w:t>Draṣṭā was smiling. It was a different smile from the first.</w:t>
       </w:r>
@@ -877,8 +903,9 @@
         <w:rPr>
           <w:b w:val="0"/>
           <w:i w:val="0"/>
+          <w:strike w:val="0"/>
         </w:rPr>
-        <w:t>The Ancient One looked at Elara with the same steady patience she had shown at the start, and something at the corner of her mouth eased.</w:t>
+        <w:t>"Not by destiny," the Ancient One said, "but because you acted while action still mattered. The record carries your name, not ours. There is a line in the Sector One induction file that has been struck through and written again, and beside it an audit reference, and beside that a name. Kubera has read it. Whoever moves against those boys now must move through you." She didn't raise her voice. "We did not choose you, Monitor. You signed."</w:t>
       </w:r>
     </w:p>
     <w:p>
@@ -886,8 +913,9 @@
         <w:rPr>
           <w:b w:val="0"/>
           <w:i w:val="0"/>
+          <w:strike w:val="0"/>
         </w:rPr>
-        <w:t>"Not by destiny," she said, "but because you acted while action still mattered. What you set in motion cannot now be carried by anyone else."</w:t>
+        <w:t>Nobody at the table asked what she had done in the vaults. Nobody needed to.</w:t>
       </w:r>
     </w:p>
     <w:p>
@@ -895,8 +923,9 @@
         <w:rPr>
           <w:b w:val="0"/>
           <w:i w:val="0"/>
+          <w:strike w:val="0"/>
         </w:rPr>
-        <w:t>Nobody sat down. Nobody wrote the breach into anything. The elders stood around the long table with the three cards still face up between them, the king, the warrior, the head that swallowed the sun, and waited for Elara to rise and stand with them, the way a student is called to the front of a hall.</w:t>
+        <w:t>"So hear the price," the Ancient One said, "since you have already paid the first of it. Drona will not take your name off that record. It will not lie for you. If Kubera brings that line before the houses, Drona will say what is true, that its monitor signed, and nothing more. In return you stay where you put yourself. You are the monitor of record for those three boys for as long as this lasts. Every eye that turns toward them will find you first."</w:t>
       </w:r>
     </w:p>
     <w:p>
@@ -904,6 +933,117 @@
         <w:rPr>
           <w:b w:val="0"/>
           <w:i w:val="0"/>
+          <w:strike w:val="0"/>
+        </w:rPr>
+        <w:t>Anandi's hand moved on the table and was still. Kavik's stayed on his pen.</w:t>
+      </w:r>
+    </w:p>
+    <w:p>
+      <w:r>
+        <w:rPr>
+          <w:b w:val="0"/>
+          <w:i w:val="0"/>
+          <w:strike w:val="0"/>
+        </w:rPr>
+        <w:t>"Drona stands behind you," the Ancient One said. "Not in front. Your mentors will be your shadows from today, whatever follows. They cannot carry it for you."</w:t>
+      </w:r>
+    </w:p>
+    <w:p>
+      <w:r>
+        <w:rPr>
+          <w:b w:val="0"/>
+          <w:i w:val="0"/>
+          <w:strike w:val="0"/>
+        </w:rPr>
+        <w:t>Elara sat with it. Her name at the end of a struck line, and a door sensor's green eye, and a clerk's felt square worn shiny from other names. She had known when she signed. She hadn't known anyone would come and read it to her.</w:t>
+      </w:r>
+    </w:p>
+    <w:p>
+      <w:r>
+        <w:rPr>
+          <w:b w:val="0"/>
+          <w:i w:val="0"/>
+          <w:strike w:val="0"/>
+        </w:rPr>
+        <w:t>"Then the file comes to me," she said.</w:t>
+      </w:r>
+    </w:p>
+    <w:p>
+      <w:r>
+        <w:rPr>
+          <w:b w:val="0"/>
+          <w:i w:val="0"/>
+          <w:strike w:val="0"/>
+        </w:rPr>
+        <w:t>Sarvajña's eyebrows rose a fraction.</w:t>
+      </w:r>
+    </w:p>
+    <w:p>
+      <w:r>
+        <w:rPr>
+          <w:b w:val="0"/>
+          <w:i w:val="0"/>
+          <w:strike w:val="0"/>
+        </w:rPr>
+        <w:t>"Cohort 3A. There's a packet on my table now that the system wrote about them while I was still at my console." Her voice was steadier than she was. "If every eye that turns toward them finds me first, then I read what's written about them first. Nothing on those boys goes to any board, from any house, until it has crossed my console. Drona files nothing on them I haven't seen."</w:t>
+      </w:r>
+    </w:p>
+    <w:p>
+      <w:r>
+        <w:rPr>
+          <w:b w:val="0"/>
+          <w:i w:val="0"/>
+          <w:strike w:val="0"/>
+        </w:rPr>
+        <w:t>"That is a monitor under review asking to audit her own review," Sarvajña said.</w:t>
+      </w:r>
+    </w:p>
+    <w:p>
+      <w:r>
+        <w:rPr>
+          <w:b w:val="0"/>
+          <w:i w:val="0"/>
+          <w:strike w:val="0"/>
+        </w:rPr>
+        <w:t>"It's a monitor asking to read what's said about the people she answers for. You just told me I answer for them."</w:t>
+      </w:r>
+    </w:p>
+    <w:p>
+      <w:r>
+        <w:rPr>
+          <w:b w:val="0"/>
+          <w:i w:val="0"/>
+          <w:strike w:val="0"/>
+        </w:rPr>
+        <w:t>Draṣṭā laughed, once, under her breath.</w:t>
+      </w:r>
+    </w:p>
+    <w:p>
+      <w:r>
+        <w:rPr>
+          <w:b w:val="0"/>
+          <w:i w:val="0"/>
+          <w:strike w:val="0"/>
+        </w:rPr>
+        <w:t>The Ancient One looked at Elara for a long moment with the same steady patience she had shown at the start, and something at the corner of her mouth eased.</w:t>
+      </w:r>
+    </w:p>
+    <w:p>
+      <w:r>
+        <w:rPr>
+          <w:b w:val="0"/>
+          <w:i w:val="0"/>
+          <w:strike w:val="0"/>
+        </w:rPr>
+        <w:t>"Agreed," she said. "And one more thing, Monitor, so it is said aloud in this room. Once you have stood in front of a thing, you do not get to step out of its way."</w:t>
+      </w:r>
+    </w:p>
+    <w:p>
+      <w:r>
+        <w:rPr>
+          <w:b w:val="0"/>
+          <w:i w:val="0"/>
+          <w:strike w:val="0"/>
         </w:rPr>
         <w:t>Somewhere down the wing a brush was being guided across a damaged painting by two fingers that would not let it slip.</w:t>
       </w:r>
@@ -913,8 +1053,9 @@
         <w:rPr>
           <w:b w:val="0"/>
           <w:i w:val="0"/>
+          <w:strike w:val="0"/>
         </w:rPr>
-        <w:t>She had come up the corridor rehearsing a defense. Nobody had asked for one. Her legs held when she stood, and her right hand had curled again at her side, around a pencil that wasn't there.</w:t>
+        <w:t>"Do you accept?"</w:t>
       </w:r>
     </w:p>
     <w:p>
@@ -922,8 +1063,19 @@
         <w:rPr>
           <w:b w:val="0"/>
           <w:i w:val="0"/>
+          <w:strike w:val="0"/>
         </w:rPr>
-        <w:t>It was a reckoning.</w:t>
+        <w:t>Elara's right hand had curled at her side around a pencil that wasn't there. She opened it and laid it flat on the transfer sheet, over the word FROZEN.</w:t>
+      </w:r>
+    </w:p>
+    <w:p>
+      <w:r>
+        <w:rPr>
+          <w:b w:val="0"/>
+          <w:i w:val="0"/>
+          <w:strike w:val="0"/>
+        </w:rPr>
+        <w:t>"I signed," she said.</w:t>
       </w:r>
     </w:p>
     <w:sectPr>

</xml_diff>

<commit_message>
Pronunciation: front-matter Names and Pronunciation page; no guides in dialogue
- Every guide now sits at the word's first narration mention (speech tags count as narration)
- Patal Loka, graha, dal and sensei are only ever spoken: front-matter page only
- tools/pronounce.js + pronounce-entries.js re-apply the rule; _rules.md and glossary updated

Co-Authored-By: Claude Opus 5.5 <noreply@anthropic.com>
</commit_message>
<xml_diff>
--- a/claude-notes/manuscript-v2/07-then-the-silence-merged.docx
+++ b/claude-notes/manuscript-v2/07-then-the-silence-merged.docx
@@ -527,7 +527,7 @@
           <w:i w:val="0"/>
           <w:strike w:val="0"/>
         </w:rPr>
-        <w:t>The man in the saffron robe spoke first, his voice deep and even. "I am Sarvajña (suhr-VUG-yuh), the all-knowing. I keep Drona steady upon its three pillars: knowledge, disciplined inquiry, and the duty to serve truth before power."</w:t>
+        <w:t>The man in the saffron robe spoke first, his voice deep and even. "I am Sarvajña, the all-knowing. I keep Drona steady upon its three pillars: knowledge, disciplined inquiry, and the duty to serve truth before power."</w:t>
       </w:r>
     </w:p>
     <w:p>
@@ -537,7 +537,7 @@
           <w:i w:val="0"/>
           <w:strike w:val="0"/>
         </w:rPr>
-        <w:t>"I am Draṣṭā (DRUSH-tah), the seer," said the woman with the cards. There was nothing theatrical in it. "My duty is to know the three times: the past, the present, and the future. Nothing is certain, and I do not pretend otherwise."</w:t>
+        <w:t>"I am Draṣṭā, the seer," said the woman with the cards. There was nothing theatrical in it. "My duty is to know the three times: the past, the present, and the future. Nothing is certain, and I do not pretend otherwise."</w:t>
       </w:r>
     </w:p>
     <w:p>
@@ -625,7 +625,7 @@
           <w:i w:val="0"/>
           <w:strike w:val="0"/>
         </w:rPr>
-        <w:t>Draṣṭā looked at her and smiled faintly, as if she had heard the question cross the table without being spoken. She offered no answer. She waited.</w:t>
+        <w:t>Draṣṭā (DRUSH-tah) looked at her and smiled faintly, as if she had heard the question cross the table without being spoken. She offered no answer. She waited.</w:t>
       </w:r>
     </w:p>
     <w:p>
@@ -779,7 +779,7 @@
           <w:i w:val="0"/>
           <w:strike w:val="0"/>
         </w:rPr>
-        <w:t xml:space="preserve"> (GRUH-huh). That which seizes."</w:t>
+        <w:t>. That which seizes."</w:t>
       </w:r>
     </w:p>
     <w:p>
@@ -809,7 +809,7 @@
           <w:i w:val="0"/>
           <w:strike w:val="0"/>
         </w:rPr>
-        <w:t>Sarvajña leaned forward. The stones at his cuff touched the wood with a dry click. He took a single printed sheet from inside his robe and slid it across the table to her.</w:t>
+        <w:t>Sarvajña (suhr-VUG-yuh) leaned forward. The stones at his cuff touched the wood with a dry click. He took a single printed sheet from inside his robe and slid it across the table to her.</w:t>
       </w:r>
     </w:p>
     <w:p>

</xml_diff>

<commit_message>
Ch7 round 3: the review happens (confession, Anandi objects and is overruled)
Co-Authored-By: Claude Opus 5.5 <noreply@anthropic.com>
</commit_message>
<xml_diff>
--- a/claude-notes/manuscript-v2/07-then-the-silence-merged.docx
+++ b/claude-notes/manuscript-v2/07-then-the-silence-merged.docx
@@ -23,7 +23,7 @@
           <w:strike w:val="0"/>
           <w:color w:val="5C6B7D"/>
         </w:rPr>
-        <w:t>To her, Gage, Ben, and Otto weren’t children experiencing their first full stomach; they were newly activated units on her ledger. She noted the Engine sharing his polymer pouch — a deviation in resource management — with a flick of her finger.</w:t>
+        <w:t>To her, Gage, Ben, and Otto weren’t children experiencing their first full stomach; they were newly activated units on her ledger.</w:t>
       </w:r>
     </w:p>
     <w:p>
@@ -79,7 +79,7 @@
           <w:i w:val="0"/>
           <w:strike w:val="0"/>
         </w:rPr>
-        <w:t>She bathed. She changed. She drank the nutrient broth the room had decided she needed, printed the packet, and sat down at the study table with it. Gage's pulse profile. Ben's stress spikes. Otto's proximity data. On the fourth page, the system's first note on synchronized response, in language so level it could have been describing a pump. The system had seen it before she admitted it. It had only lacked a category, and she had given it one, and then gone down into the vaults and taken it away again.</w:t>
+        <w:t>She bathed. She changed. She drank the nutrient broth the room had decided she needed, printed the packet, and sat down at the study table with it. Gage's pulse profile. Ben's stress spikes. Otto's proximity data. On the fourth page, the system's first note on synchronized response, in language so level it could have been describing a pump. The system had seen it before she admitted it. It had only lacked a category. She had offered it one at her console, and the system had refused it. Then she had gone down into the vaults and struck out the category it had chosen for itself.</w:t>
       </w:r>
     </w:p>
     <w:p>
@@ -289,7 +289,7 @@
           <w:i w:val="0"/>
           <w:strike w:val="0"/>
         </w:rPr>
-        <w:t>The hallway was familiar enough to hurt: the alcove beside the archive lift, the bench under the ventilation grille, the window that showed only filtered cloud. Then the turn into the Corridor of Knowledge, where the architecture changed without getting any grander. Drona had never needed height to announce itself. Its corridor was narrow and pale and lined with sealed glass cases: a cracked lens, a brass measuring arm, bone-handled instruments for studying the stars. Portraits of scientists hung between shrines to the ancient sanyashis. The oldest books lay open side by side, an astronomical text beside a religious epic.</w:t>
+        <w:t>The hallway was familiar enough to hurt: the alcove beside the archive lift, the bench under the ventilation grille, the window that showed only filtered cloud. Then the turn into the Corridor of Knowledge, where the architecture changed without getting any grander. Drona had never needed height to announce itself. Its corridor was narrow and pale and lined with sealed glass cases: a cracked lens, a brass measuring arm, bone-handled instruments for studying the stars. Portraits of scientists hung between shrines to the ancient sannyasis. The oldest books lay open side by side, an astronomical text beside a religious epic.</w:t>
       </w:r>
     </w:p>
     <w:p>
@@ -389,7 +389,7 @@
           <w:i w:val="0"/>
           <w:strike w:val="0"/>
         </w:rPr>
-        <w:t>The last sat at the far end of the table. A plain grey shawl, darned once at the shoulder in thread a shade too dark, over a cotton tunic, a face lined with the patience of years, and no mark of lineage or office anywhere on her. It was hard to look away from her eyes. They held a steadiness older than the room.</w:t>
+        <w:t>The last sat at the far end of the table. A plain grey shawl, darned once at the shoulder in thread a shade too dark, over a cotton tunic, a face lined with the patience of years, and no mark of lineage or office anywhere on her. It was hard to look away from her eyes. They held a steadiness the room did not have.</w:t>
       </w:r>
     </w:p>
     <w:p>
@@ -419,7 +419,7 @@
           <w:i w:val="0"/>
           <w:strike w:val="0"/>
         </w:rPr>
-        <w:t>The palm turned outward, toward Elara, fingers relaxed and open. That was all. The words caught in Elara's throat and stayed there. Her mouth would not open. The breath she had drawn stalled halfway in, and her chest locked around it and would not let it go. The silence thickened until she could not tell whether it belonged to the room or to her own body.</w:t>
+        <w:t>It rose a hand's width above the wood and stopped there, palm down, fingers loose. That was all. The words caught in Elara's throat and stayed there. Her mouth would not open. The breath she had drawn stalled halfway in, and her chest locked around it and would not let it go. The silence thickened until she could not tell whether it belonged to the room or to her own body.</w:t>
       </w:r>
     </w:p>
     <w:p>
@@ -557,7 +557,7 @@
           <w:i w:val="0"/>
           <w:strike w:val="0"/>
         </w:rPr>
-        <w:t>"I am Drona's Grandmaster, known by many names depending on who you are and what you believe in," she said. "Today, the Ancient One sits well with me."</w:t>
+        <w:t>"I am Drona's Grandmaster," she said. "The title passes from Grandmaster to Grandmaster, and whoever holds it leaves her own name at the door. Today, the Ancient One sits well with me."</w:t>
       </w:r>
     </w:p>
     <w:p>
@@ -775,16 +775,6 @@
           <w:i w:val="0"/>
           <w:strike w:val="0"/>
         </w:rPr>
-        <w:t>"Prepare while preparation is still possible," Draṣṭā said.</w:t>
-      </w:r>
-    </w:p>
-    <w:p>
-      <w:r>
-        <w:rPr>
-          <w:b w:val="0"/>
-          <w:i w:val="0"/>
-          <w:strike w:val="0"/>
-        </w:rPr>
         <w:t>Sarvajña leaned forward. The stones at his cuff touched the wood with a dry click. He took a single printed sheet from inside his robe and slid it across the table to her.</w:t>
       </w:r>
     </w:p>
@@ -805,7 +795,7 @@
           <w:i w:val="0"/>
           <w:strike w:val="0"/>
         </w:rPr>
-        <w:t>"Nine days," Sarvajña said. "No reason given. No officer named. Something indescribable has begun to form beneath the scales, and that is the first place it has touched us. It has no name and no office, and a thing like that is not built inside Kubera without its Grandmaster." His thumb turned one of the stones. "Kubera's representative failed at your station, in front of the other houses. He has since disappeared from Kubera's rolls."</w:t>
+        <w:t>"Nine days," Sarvajña said. "Before your Initiation began. Something is moving inside Kubera with no name and no office on it, and that is the first place it touched us. Nothing moves in that house without the Grandmaster's hand." His thumb turned one of the stones. "Kubera's representative failed at your station, in front of the other houses. He has since disappeared from Kubera's rolls."</w:t>
       </w:r>
     </w:p>
     <w:p>
@@ -915,7 +905,53 @@
           <w:i w:val="0"/>
           <w:strike w:val="0"/>
         </w:rPr>
-        <w:t>Nobody at the table asked what she had done in the vaults. Nobody needed to.</w:t>
+        <w:t>"The vaults, Elara." Anandi's voice was the one from her first-year lectures. "Tell it in order. Leave nothing out."</w:t>
+      </w:r>
+    </w:p>
+    <w:p>
+      <w:r>
+        <w:rPr>
+          <w:b w:val="0"/>
+          <w:i w:val="0"/>
+          <w:strike w:val="0"/>
+        </w:rPr>
+        <w:t>She told it in order. Ledger verification, the one right an operator under review still held, and twenty minutes counting down on the main board. Her own name in the clerk's register. The duty terminal in its alcove with nobody at it, and the audit reference it had taken as proof.</w:t>
+      </w:r>
+    </w:p>
+    <w:p>
+      <w:r>
+        <w:rPr>
+          <w:b w:val="0"/>
+          <w:i w:val="0"/>
+          <w:strike w:val="0"/>
+        </w:rPr>
+        <w:t>"I struck two fields and wrote them again," she said. "Standard cohort. Separation directives withheld. The system warned me it was tampering, and I confirmed through the warning. My name is at the end of it."</w:t>
+      </w:r>
+    </w:p>
+    <w:p>
+      <w:r>
+        <w:rPr>
+          <w:b w:val="0"/>
+          <w:i w:val="0"/>
+          <w:strike w:val="0"/>
+        </w:rPr>
+        <w:t xml:space="preserve">Anandi heard all of it without interrupting. At the word </w:t>
+      </w:r>
+      <w:r>
+        <w:rPr>
+          <w:b w:val="0"/>
+          <w:i/>
+          <w:strike w:val="0"/>
+        </w:rPr>
+        <w:t>withheld</w:t>
+      </w:r>
+      <w:r>
+        <w:rPr>
+          <w:b w:val="0"/>
+          <w:i w:val="0"/>
+          <w:strike w:val="0"/>
+        </w:rPr>
+        <w:t xml:space="preserve"> she closed her eyes, and when she opened them they went back to Elara and stayed there.</w:t>
       </w:r>
     </w:p>
     <w:p>
@@ -935,7 +971,7 @@
           <w:i w:val="0"/>
           <w:strike w:val="0"/>
         </w:rPr>
-        <w:t>Anandi's hand moved on the table and was still. Kavik's stayed on his pen.</w:t>
+        <w:t>Kavik's hand stayed on his pen.</w:t>
       </w:r>
     </w:p>
     <w:p>
@@ -975,7 +1011,7 @@
           <w:i w:val="0"/>
           <w:strike w:val="0"/>
         </w:rPr>
-        <w:t>Sarvajña's eyebrows rose a fraction.</w:t>
+        <w:t>Anandi's head came up. Her hand went out across the wood toward Elara's and stopped short of it.</w:t>
       </w:r>
     </w:p>
     <w:p>
@@ -995,7 +1031,7 @@
           <w:i w:val="0"/>
           <w:strike w:val="0"/>
         </w:rPr>
-        <w:t>"That is a monitor under review asking to audit her own review," Sarvajña said.</w:t>
+        <w:t>"That is a monitor under review asking to audit her own review," Anandi said. "When Kubera comes for that struck line, it will come for this as well."</w:t>
       </w:r>
     </w:p>
     <w:p>
@@ -1025,7 +1061,7 @@
           <w:i w:val="0"/>
           <w:strike w:val="0"/>
         </w:rPr>
-        <w:t>The Ancient One looked at Elara for a long moment with the same steady patience she had shown at the start, and something at the corner of her mouth eased.</w:t>
+        <w:t>Anandi did not. "Grandmaster, I would have it recorded that I objected."</w:t>
       </w:r>
     </w:p>
     <w:p>
@@ -1035,7 +1071,7 @@
           <w:i w:val="0"/>
           <w:strike w:val="0"/>
         </w:rPr>
-        <w:t>"Agreed," she said. "And one more thing, Monitor, so it is said aloud in this room. Once you have stood in front of a thing, you do not get to step out of its way."</w:t>
+        <w:t>"It is recorded." The Ancient One did not turn her head. "So is her answer."</w:t>
       </w:r>
     </w:p>
     <w:p>
@@ -1045,7 +1081,17 @@
           <w:i w:val="0"/>
           <w:strike w:val="0"/>
         </w:rPr>
-        <w:t>Somewhere down the wing a brush was being guided across a damaged painting by two fingers that would not let it slip.</w:t>
+        <w:t>She looked at Elara for a long moment with the same steady patience she had shown at the start, and something at the corner of her mouth eased.</w:t>
+      </w:r>
+    </w:p>
+    <w:p>
+      <w:r>
+        <w:rPr>
+          <w:b w:val="0"/>
+          <w:i w:val="0"/>
+          <w:strike w:val="0"/>
+        </w:rPr>
+        <w:t>"Agreed," she said. "Then stay where you are."</w:t>
       </w:r>
     </w:p>
     <w:p>

</xml_diff>

<commit_message>
Ch7 final: review stands open, Vishnu beat, Daren named, small trims
Co-Authored-By: Claude Opus 5.5 <noreply@anthropic.com>
</commit_message>
<xml_diff>
--- a/claude-notes/manuscript-v2/07-then-the-silence-merged.docx
+++ b/claude-notes/manuscript-v2/07-then-the-silence-merged.docx
@@ -119,7 +119,7 @@
           <w:i w:val="0"/>
           <w:strike w:val="0"/>
         </w:rPr>
-        <w:t>At 5:00 a.m., someone knocked.</w:t>
+        <w:t>At 6:00 a.m., someone knocked.</w:t>
       </w:r>
     </w:p>
     <w:p>
@@ -269,7 +269,7 @@
           <w:i w:val="0"/>
           <w:strike w:val="0"/>
         </w:rPr>
-        <w:t>Her father, Vishnu, had never let her think of karma as a court waiting with a sentence. Karma, he said, was the shape a choice makes after it leaves the person who made it. Hers had left her at an unattended terminal in the sub-tier vaults, and it had been travelling ever since.</w:t>
+        <w:t>Her father, Vishnu, had never let her think of karma as a court waiting with a sentence. Karma, he said, was what a choice did once it left your hands. Hers had left them at an unattended terminal in the vaults.</w:t>
       </w:r>
     </w:p>
     <w:p>
@@ -439,7 +439,7 @@
           <w:i w:val="0"/>
           <w:strike w:val="0"/>
         </w:rPr>
-        <w:t>Elara's lungs tore open. She bent over the table with one hand at her collar, gasping, ragged, the feeling of drowning and being hauled onto a deck at once. Her eyes ran. Her pulse slammed in her ears. When she could, she forced herself upright. Her voice and her breath were things this table could grant or withhold, and they had wanted her to know it before she said a word.</w:t>
+        <w:t>Elara's lungs tore open. She bent over the table with one hand at her collar, gasping, ragged, the feeling of drowning and being hauled onto a deck at once. Her eyes ran. Her pulse slammed in her ears. When she could, she forced herself upright. Nobody at the table had moved.</w:t>
       </w:r>
     </w:p>
     <w:p>
@@ -597,7 +597,7 @@
           <w:i w:val="0"/>
           <w:strike w:val="0"/>
         </w:rPr>
-        <w:t>"Choose one."</w:t>
+        <w:t>"Choose."</w:t>
       </w:r>
     </w:p>
     <w:p>
@@ -765,6 +765,16 @@
           <w:i w:val="0"/>
           <w:strike w:val="0"/>
         </w:rPr>
+        <w:t>Her father's name. Elara didn't look up.</w:t>
+      </w:r>
+    </w:p>
+    <w:p>
+      <w:r>
+        <w:rPr>
+          <w:b w:val="0"/>
+          <w:i w:val="0"/>
+          <w:strike w:val="0"/>
+        </w:rPr>
         <w:t>She left the three cards face up and said nothing about what any of them meant to Elara, and Elara found she couldn't stop looking at the second.</w:t>
       </w:r>
     </w:p>
@@ -795,7 +805,7 @@
           <w:i w:val="0"/>
           <w:strike w:val="0"/>
         </w:rPr>
-        <w:t>"Nine days," Sarvajña said. "Before your Initiation began. Something is moving inside Kubera with no name and no office on it, and that is the first place it touched us. Nothing moves in that house without the Grandmaster's hand." His thumb turned one of the stones. "Kubera's representative failed at your station, in front of the other houses. He has since disappeared from Kubera's rolls."</w:t>
+        <w:t>"Nine days," Sarvajña said. "Before your Initiation began. Something is moving inside Kubera with no name and no office on it, and that is the first place it touched us. Nothing moves in that house without the Grandmaster's hand." His thumb turned one of the stones. "Daren of Kubera sat THRESHOLD at your station and failed in front of the other houses. His name has since come off Kubera's rolls."</w:t>
       </w:r>
     </w:p>
     <w:p>
@@ -991,7 +1001,7 @@
           <w:i w:val="0"/>
           <w:strike w:val="0"/>
         </w:rPr>
-        <w:t>Elara sat with it. Her name at the end of a struck line, and a door sensor's green eye, and a clerk's felt square worn shiny from other names. She had known when she signed. She hadn't known anyone would come and read it to her.</w:t>
+        <w:t>Elara sat with it. Her name at the end of a struck line, and a door sensor's green eye, and a clerk's felt square worn shiny from other names.</w:t>
       </w:r>
     </w:p>
     <w:p>
@@ -1091,17 +1101,7 @@
           <w:i w:val="0"/>
           <w:strike w:val="0"/>
         </w:rPr>
-        <w:t>"Agreed," she said. "Then stay where you are."</w:t>
-      </w:r>
-    </w:p>
-    <w:p>
-      <w:r>
-        <w:rPr>
-          <w:b w:val="0"/>
-          <w:i w:val="0"/>
-          <w:strike w:val="0"/>
-        </w:rPr>
-        <w:t>"Do you accept?"</w:t>
+        <w:t>"Agreed," she said. "And the review stands open until this is finished. Do you accept?"</w:t>
       </w:r>
     </w:p>
     <w:p>

</xml_diff>

<commit_message>
Ch7: THRESHOLD beside you; trim repeat; 'This table just told me'
Co-Authored-By: Claude Opus 5.5 <noreply@anthropic.com>
</commit_message>
<xml_diff>
--- a/claude-notes/manuscript-v2/07-then-the-silence-merged.docx
+++ b/claude-notes/manuscript-v2/07-then-the-silence-merged.docx
@@ -805,7 +805,7 @@
           <w:i w:val="0"/>
           <w:strike w:val="0"/>
         </w:rPr>
-        <w:t>"Nine days," Sarvajña said. "Before your Initiation began. Something is moving inside Kubera with no name and no office on it, and that is the first place it touched us. Nothing moves in that house without the Grandmaster's hand." His thumb turned one of the stones. "Daren of Kubera sat THRESHOLD at your station and failed in front of the other houses. His name has since come off Kubera's rolls."</w:t>
+        <w:t>"Nine days," Sarvajña said. "Before your Initiation began. Something is moving inside Kubera with no name and no office on it, and that is the first place it touched us. Nothing moves in that house without the Grandmaster's hand." His thumb turned one of the stones. "Daren of Kubera sat THRESHOLD beside you and failed in front of the other houses. His name has since come off Kubera's rolls."</w:t>
       </w:r>
     </w:p>
     <w:p>
@@ -815,7 +815,7 @@
           <w:i w:val="0"/>
           <w:strike w:val="0"/>
         </w:rPr>
-        <w:t>Daren's chair at THRESHOLD. His pen tapping twice on the printed manual. Elara's thumb went to the raw hangnail on her left hand and pressed until it stung.</w:t>
+        <w:t>Daren's chair. His pen tapping twice on the printed manual. Elara's thumb went to the raw hangnail on her left hand and pressed until it stung.</w:t>
       </w:r>
     </w:p>
     <w:p>
@@ -1051,7 +1051,7 @@
           <w:i w:val="0"/>
           <w:strike w:val="0"/>
         </w:rPr>
-        <w:t>"It's a monitor asking to read what's said about the people she answers for. You just told me I answer for them."</w:t>
+        <w:t>"It's a monitor asking to read what's said about the people she answers for. This table just told me I answer for them."</w:t>
       </w:r>
     </w:p>
     <w:p>

</xml_diff>